<commit_message>
Papier en-tête : infos légales de l'ancien modèle, corps vide
Co-Authored-By: Claude Sonnet 5.5 <noreply@anthropic.com>
Claude-Session: https://claude.ai/code/session_01XPwnZBmWUGhvYebrP3X3Z2
</commit_message>
<xml_diff>
--- a/papier_en_tete/Papier_en_tete_Enedril_A4.docx
+++ b/papier_en_tete/Papier_en_tete_Enedril_A4.docx
@@ -2,166 +2,6 @@
 <file path=word/document.xml><?xml version="1.0" encoding="utf-8"?>
 <w:document xmlns:wpc="http://schemas.microsoft.com/office/word/2010/wordprocessingCanvas" xmlns:mo="http://schemas.microsoft.com/office/mac/office/2008/main" xmlns:mc="http://schemas.openxmlformats.org/markup-compatibility/2006" xmlns:mv="urn:schemas-microsoft-com:mac:vml" xmlns:o="urn:schemas-microsoft-com:office:office" xmlns:r="http://schemas.openxmlformats.org/officeDocument/2006/relationships" xmlns:m="http://schemas.openxmlformats.org/officeDocument/2006/math" xmlns:v="urn:schemas-microsoft-com:vml" xmlns:wp14="http://schemas.microsoft.com/office/word/2010/wordprocessingDrawing" xmlns:wp="http://schemas.openxmlformats.org/drawingml/2006/wordprocessingDrawing" xmlns:w10="urn:schemas-microsoft-com:office:word" xmlns:w="http://schemas.openxmlformats.org/wordprocessingml/2006/main" xmlns:w14="http://schemas.microsoft.com/office/word/2010/wordml" xmlns:wpg="http://schemas.microsoft.com/office/word/2010/wordprocessingGroup" xmlns:wpi="http://schemas.microsoft.com/office/word/2010/wordprocessingInk" xmlns:wne="http://schemas.microsoft.com/office/word/2006/wordml" xmlns:wps="http://schemas.microsoft.com/office/word/2010/wordprocessingShape" mc:Ignorable="w14 wp14">
   <w:body>
-    <w:p>
-      <w:pPr>
-        <w:spacing w:after="360"/>
-        <w:jc w:val="right"/>
-      </w:pPr>
-      <w:r>
-        <w:rPr>
-          <w:rFonts w:ascii="Ubuntu Mono" w:hAnsi="Ubuntu Mono" w:cs="Ubuntu Mono" w:eastAsia="Ubuntu Mono"/>
-          <w:b w:val="0"/>
-          <w:color w:val="5A6B7F"/>
-          <w:sz w:val="22"/>
-        </w:rPr>
-        <w:t>Lons, le [date]</w:t>
-      </w:r>
-    </w:p>
-    <w:p>
-      <w:pPr>
-        <w:spacing w:after="0"/>
-      </w:pPr>
-      <w:r>
-        <w:rPr>
-          <w:rFonts w:ascii="Ubuntu Mono" w:hAnsi="Ubuntu Mono" w:cs="Ubuntu Mono" w:eastAsia="Ubuntu Mono"/>
-          <w:b/>
-          <w:sz w:val="23"/>
-        </w:rPr>
-        <w:t>[Nom du destinataire]</w:t>
-      </w:r>
-    </w:p>
-    <w:p>
-      <w:pPr>
-        <w:spacing w:after="0"/>
-      </w:pPr>
-      <w:r>
-        <w:rPr>
-          <w:rFonts w:ascii="Ubuntu Mono" w:hAnsi="Ubuntu Mono" w:cs="Ubuntu Mono" w:eastAsia="Ubuntu Mono"/>
-          <w:b w:val="0"/>
-          <w:sz w:val="23"/>
-        </w:rPr>
-        <w:t>[Société]</w:t>
-      </w:r>
-    </w:p>
-    <w:p>
-      <w:pPr>
-        <w:spacing w:after="0"/>
-      </w:pPr>
-      <w:r>
-        <w:rPr>
-          <w:rFonts w:ascii="Ubuntu Mono" w:hAnsi="Ubuntu Mono" w:cs="Ubuntu Mono" w:eastAsia="Ubuntu Mono"/>
-          <w:b w:val="0"/>
-          <w:sz w:val="23"/>
-        </w:rPr>
-        <w:t>[Adresse]</w:t>
-      </w:r>
-    </w:p>
-    <w:p>
-      <w:pPr>
-        <w:spacing w:after="360"/>
-      </w:pPr>
-      <w:r>
-        <w:rPr>
-          <w:rFonts w:ascii="Ubuntu Mono" w:hAnsi="Ubuntu Mono" w:cs="Ubuntu Mono" w:eastAsia="Ubuntu Mono"/>
-          <w:b w:val="0"/>
-          <w:sz w:val="23"/>
-        </w:rPr>
-        <w:t>[Code postal · Ville]</w:t>
-      </w:r>
-    </w:p>
-    <w:p>
-      <w:pPr>
-        <w:spacing w:after="240"/>
-      </w:pPr>
-      <w:r>
-        <w:rPr>
-          <w:rFonts w:ascii="Ubuntu Mono" w:hAnsi="Ubuntu Mono" w:cs="Ubuntu Mono" w:eastAsia="Ubuntu Mono"/>
-          <w:b/>
-          <w:color w:val="0A4FA0"/>
-          <w:sz w:val="23"/>
-        </w:rPr>
-        <w:t>Objet : [objet du courrier]</w:t>
-      </w:r>
-    </w:p>
-    <w:p>
-      <w:pPr>
-        <w:spacing w:after="160"/>
-      </w:pPr>
-      <w:r>
-        <w:rPr>
-          <w:rFonts w:ascii="Ubuntu Mono" w:hAnsi="Ubuntu Mono" w:cs="Ubuntu Mono" w:eastAsia="Ubuntu Mono"/>
-          <w:b w:val="0"/>
-          <w:sz w:val="23"/>
-        </w:rPr>
-        <w:t>Madame, Monsieur,</w:t>
-      </w:r>
-    </w:p>
-    <w:p>
-      <w:pPr>
-        <w:spacing w:after="160"/>
-      </w:pPr>
-      <w:r>
-        <w:rPr>
-          <w:rFonts w:ascii="Ubuntu Mono" w:hAnsi="Ubuntu Mono" w:cs="Ubuntu Mono" w:eastAsia="Ubuntu Mono"/>
-          <w:b w:val="0"/>
-          <w:sz w:val="23"/>
-        </w:rPr>
-        <w:t>[Corps du courrier. Remplacez ce texte par le vôtre. La police du modèle est Ubuntu Mono.]</w:t>
-      </w:r>
-    </w:p>
-    <w:p>
-      <w:pPr>
-        <w:spacing w:after="160"/>
-      </w:pPr>
-      <w:r>
-        <w:rPr>
-          <w:rFonts w:ascii="Ubuntu Mono" w:hAnsi="Ubuntu Mono" w:cs="Ubuntu Mono" w:eastAsia="Ubuntu Mono"/>
-          <w:b w:val="0"/>
-          <w:sz w:val="23"/>
-        </w:rPr>
-        <w:t>Nous restons à votre disposition pour tout complément d’information.</w:t>
-      </w:r>
-    </w:p>
-    <w:p>
-      <w:pPr>
-        <w:spacing w:after="560"/>
-      </w:pPr>
-      <w:r>
-        <w:rPr>
-          <w:rFonts w:ascii="Ubuntu Mono" w:hAnsi="Ubuntu Mono" w:cs="Ubuntu Mono" w:eastAsia="Ubuntu Mono"/>
-          <w:b w:val="0"/>
-          <w:sz w:val="23"/>
-        </w:rPr>
-        <w:t>Cordialement,</w:t>
-      </w:r>
-    </w:p>
-    <w:p>
-      <w:pPr>
-        <w:spacing w:after="0"/>
-      </w:pPr>
-      <w:r>
-        <w:rPr>
-          <w:rFonts w:ascii="Ubuntu Mono" w:hAnsi="Ubuntu Mono" w:cs="Ubuntu Mono" w:eastAsia="Ubuntu Mono"/>
-          <w:b/>
-          <w:sz w:val="23"/>
-        </w:rPr>
-        <w:t>[Prénom NOM]</w:t>
-      </w:r>
-    </w:p>
-    <w:p>
-      <w:pPr>
-        <w:spacing w:after="0"/>
-      </w:pPr>
-      <w:r>
-        <w:rPr>
-          <w:rFonts w:ascii="Ubuntu Mono" w:hAnsi="Ubuntu Mono" w:cs="Ubuntu Mono" w:eastAsia="Ubuntu Mono"/>
-          <w:b w:val="0"/>
-          <w:color w:val="5A6B7F"/>
-          <w:sz w:val="22"/>
-        </w:rPr>
-        <w:t>[Fonction] · Enedril</w:t>
-      </w:r>
-    </w:p>
     <w:sectPr>
       <w:headerReference w:type="default" r:id="rId9"/>
       <w:footerReference w:type="default" r:id="rId10"/>
@@ -189,7 +29,7 @@
         <w:color w:val="7A8AA0"/>
         <w:sz w:val="14"/>
       </w:rPr>
-      <w:t>[SAS au capital de … € · RCS … · SIRET … · TVA intracommunautaire FR…]</w:t>
+      <w:t>SAS au capital de 50 000 € · SIRET 794 642 462 00020 RCS Pau · TVA intracommunautaire FR11794642462 · Code APE 6420Z</w:t>
     </w:r>
   </w:p>
   <w:tbl>

</xml_diff>

<commit_message>
Papier en-tête v3 : logo officiel, coordonnées en en-tête, pied de page aligné sans bandeau
Co-Authored-By: Claude Sonnet 5.5 <noreply@anthropic.com>
Claude-Session: https://claude.ai/code/session_01XPwnZBmWUGhvYebrP3X3Z2
</commit_message>
<xml_diff>
--- a/papier_en_tete/Papier_en_tete_Enedril_A4.docx
+++ b/papier_en_tete/Papier_en_tete_Enedril_A4.docx
@@ -6,7 +6,7 @@
       <w:headerReference w:type="default" r:id="rId9"/>
       <w:footerReference w:type="default" r:id="rId10"/>
       <w:pgSz w:w="11906" w:h="16838"/>
-      <w:pgMar w:top="2608" w:right="1247" w:bottom="2211" w:left="1247" w:header="0" w:footer="0" w:gutter="0"/>
+      <w:pgMar w:top="2381" w:right="1247" w:bottom="2041" w:left="1247" w:header="680" w:footer="567" w:gutter="0"/>
       <w:cols w:space="720"/>
       <w:docGrid w:linePitch="360"/>
     </w:sectPr>
@@ -20,106 +20,92 @@
     <w:pPr>
       <w:pStyle w:val="Footer"/>
       <w:spacing w:after="0"/>
-      <w:jc w:val="center"/>
+      <w:pBdr>
+        <w:top w:val="single" w:sz="6" w:space="4" w:color="D5E1EE"/>
+      </w:pBdr>
     </w:pPr>
     <w:r>
       <w:rPr>
         <w:rFonts w:ascii="Ubuntu Mono" w:hAnsi="Ubuntu Mono" w:cs="Ubuntu Mono" w:eastAsia="Ubuntu Mono"/>
         <w:b w:val="0"/>
-        <w:color w:val="7A8AA0"/>
-        <w:sz w:val="14"/>
-      </w:rPr>
-      <w:t>SAS au capital de 50 000 € · SIRET 794 642 462 00020 RCS Pau · TVA intracommunautaire FR11794642462 · Code APE 6420Z</w:t>
+        <w:sz w:val="4"/>
+      </w:rPr>
     </w:r>
   </w:p>
   <w:tbl>
     <w:tblPr>
-      <w:tblW w:type="auto" w:w="0"/>
+      <w:tblW w:type="dxa" w:w="9412"/>
       <w:tblLayout w:type="fixed"/>
       <w:tblLook w:firstColumn="1" w:firstRow="1" w:lastColumn="0" w:lastRow="0" w:noHBand="0" w:noVBand="1" w:val="04A0"/>
-      <w:tblInd w:w="-1247" w:type="dxa"/>
       <w:tblLayout w:type="fixed"/>
     </w:tblPr>
     <w:tblGrid>
-      <w:gridCol w:w="8164"/>
-      <w:gridCol w:w="3742"/>
+      <w:gridCol w:w="6577"/>
+      <w:gridCol w:w="2835"/>
     </w:tblGrid>
     <w:tr>
       <w:tc>
         <w:tcPr>
-          <w:tcW w:type="dxa" w:w="8164"/>
-          <w:shd w:val="clear" w:color="auto" w:fill="08203F"/>
-          <w:tcMar>
-            <w:top w:w="200" w:type="dxa"/>
-            <w:left w:w="1247" w:type="dxa"/>
-            <w:bottom w:w="200" w:type="dxa"/>
-            <w:right w:w="793" w:type="dxa"/>
-          </w:tcMar>
+          <w:tcW w:type="dxa" w:w="6576"/>
           <w:vAlign w:val="center"/>
         </w:tcPr>
         <w:p>
           <w:pPr>
-            <w:spacing w:after="40"/>
+            <w:spacing w:after="0" w:line="210" w:lineRule="exact"/>
           </w:pPr>
           <w:r>
             <w:rPr>
               <w:rFonts w:ascii="Ubuntu Mono" w:hAnsi="Ubuntu Mono" w:cs="Ubuntu Mono" w:eastAsia="Ubuntu Mono"/>
               <w:b/>
-              <w:color w:val="FFFFFF"/>
-              <w:sz w:val="18"/>
+              <w:color w:val="08203F"/>
+              <w:sz w:val="16"/>
             </w:rPr>
-            <w:t>ENEDRIL · Fishing and Drilling Solutions</w:t>
+            <w:t>ENEDRIL · SAS au capital de 50 000 €</w:t>
           </w:r>
         </w:p>
         <w:p>
           <w:pPr>
-            <w:spacing w:after="0"/>
+            <w:spacing w:after="0" w:line="210" w:lineRule="exact"/>
           </w:pPr>
           <w:r>
             <w:rPr>
               <w:rFonts w:ascii="Ubuntu Mono" w:hAnsi="Ubuntu Mono" w:cs="Ubuntu Mono" w:eastAsia="Ubuntu Mono"/>
               <w:b w:val="0"/>
-              <w:color w:val="BFD9F2"/>
-              <w:sz w:val="17"/>
+              <w:color w:val="5A6B7F"/>
+              <w:sz w:val="16"/>
             </w:rPr>
-            <w:t>3 avenue des Lacs · 64140 Lons (France)</w:t>
+            <w:t>SIRET 794 642 462 00020 · RCS Pau · Code APE 6420Z</w:t>
           </w:r>
         </w:p>
         <w:p>
           <w:pPr>
-            <w:spacing w:after="0"/>
+            <w:spacing w:after="0" w:line="210" w:lineRule="exact"/>
           </w:pPr>
           <w:r>
             <w:rPr>
               <w:rFonts w:ascii="Ubuntu Mono" w:hAnsi="Ubuntu Mono" w:cs="Ubuntu Mono" w:eastAsia="Ubuntu Mono"/>
               <w:b w:val="0"/>
-              <w:color w:val="BFD9F2"/>
-              <w:sz w:val="17"/>
+              <w:color w:val="5A6B7F"/>
+              <w:sz w:val="16"/>
             </w:rPr>
-            <w:t>+33 (0)5 59 04 50 45 · info@enedril.fr · www.enedril.com</w:t>
+            <w:t>TVA intracommunautaire FR11794642462</w:t>
           </w:r>
         </w:p>
       </w:tc>
       <w:tc>
         <w:tcPr>
-          <w:tcW w:type="dxa" w:w="3742"/>
-          <w:shd w:val="clear" w:color="auto" w:fill="08203F"/>
-          <w:tcMar>
-            <w:top w:w="200" w:type="dxa"/>
-            <w:left w:w="0" w:type="dxa"/>
-            <w:bottom w:w="200" w:type="dxa"/>
-            <w:right w:w="793" w:type="dxa"/>
-          </w:tcMar>
+          <w:tcW w:type="dxa" w:w="2835"/>
           <w:vAlign w:val="center"/>
         </w:tcPr>
         <w:p>
           <w:pPr>
+            <w:spacing w:after="0"/>
             <w:jc w:val="right"/>
           </w:pPr>
           <w:r>
             <w:drawing>
               <wp:inline xmlns:a="http://schemas.openxmlformats.org/drawingml/2006/main" xmlns:pic="http://schemas.openxmlformats.org/drawingml/2006/picture">
-                <wp:extent cx="540000" cy="540000"/>
+                <wp:extent cx="522000" cy="522000"/>
                 <wp:docPr id="1" name="Picture 1"/>
                 <wp:cNvGraphicFramePr>
                   <a:graphicFrameLocks noChangeAspect="1"/>
@@ -140,7 +126,7 @@
                       <pic:spPr>
                         <a:xfrm>
                           <a:off x="0" y="0"/>
-                          <a:ext cx="540000" cy="540000"/>
+                          <a:ext cx="522000" cy="522000"/>
                         </a:xfrm>
                         <a:prstGeom prst="rect"/>
                       </pic:spPr>
@@ -151,12 +137,12 @@
             </w:drawing>
           </w:r>
           <w:r>
-            <w:t xml:space="preserve">   </w:t>
+            <w:t xml:space="preserve">  </w:t>
           </w:r>
           <w:r>
             <w:drawing>
               <wp:inline xmlns:a="http://schemas.openxmlformats.org/drawingml/2006/main" xmlns:pic="http://schemas.openxmlformats.org/drawingml/2006/picture">
-                <wp:extent cx="499932" cy="540000"/>
+                <wp:extent cx="483267" cy="522000"/>
                 <wp:docPr id="2" name="Picture 2"/>
                 <wp:cNvGraphicFramePr>
                   <a:graphicFrameLocks noChangeAspect="1"/>
@@ -165,7 +151,7 @@
                   <a:graphicData uri="http://schemas.openxmlformats.org/drawingml/2006/picture">
                     <pic:pic>
                       <pic:nvPicPr>
-                        <pic:cNvPr id="0" name="LRQA_ISO9001_blanc.png"/>
+                        <pic:cNvPr id="0" name="LRQA_ISO9001_gris.png"/>
                         <pic:cNvPicPr/>
                       </pic:nvPicPr>
                       <pic:blipFill>
@@ -177,7 +163,7 @@
                       <pic:spPr>
                         <a:xfrm>
                           <a:off x="0" y="0"/>
-                          <a:ext cx="499932" cy="540000"/>
+                          <a:ext cx="483267" cy="522000"/>
                         </a:xfrm>
                         <a:prstGeom prst="rect"/>
                       </pic:spPr>
@@ -188,7 +174,7 @@
             </w:drawing>
           </w:r>
           <w:r>
-            <w:t xml:space="preserve">   </w:t>
+            <w:t xml:space="preserve">  </w:t>
           </w:r>
         </w:p>
       </w:tc>
@@ -202,42 +188,177 @@
   <w:p>
     <w:pPr>
       <w:pStyle w:val="Header"/>
-      <w:spacing w:after="0" w:before="0"/>
-      <w:ind w:left="-1247"/>
+      <w:spacing w:after="0"/>
+    </w:pPr>
+  </w:p>
+  <w:tbl>
+    <w:tblPr>
+      <w:tblW w:type="dxa" w:w="9412"/>
+      <w:tblLayout w:type="fixed"/>
+      <w:tblLook w:firstColumn="1" w:firstRow="1" w:lastColumn="0" w:lastRow="0" w:noHBand="0" w:noVBand="1" w:val="04A0"/>
+      <w:tblLayout w:type="fixed"/>
+    </w:tblPr>
+    <w:tblGrid>
+      <w:gridCol w:w="4309"/>
+      <w:gridCol w:w="5103"/>
+    </w:tblGrid>
+    <w:tr>
+      <w:tc>
+        <w:tcPr>
+          <w:tcW w:type="dxa" w:w="4309"/>
+          <w:vAlign w:val="center"/>
+        </w:tcPr>
+        <w:p>
+          <w:pPr>
+            <w:spacing w:after="0"/>
+          </w:pPr>
+          <w:r>
+            <w:drawing>
+              <wp:inline xmlns:a="http://schemas.openxmlformats.org/drawingml/2006/main" xmlns:pic="http://schemas.openxmlformats.org/drawingml/2006/picture">
+                <wp:extent cx="2304000" cy="517248"/>
+                <wp:docPr id="1" name="Picture 1"/>
+                <wp:cNvGraphicFramePr>
+                  <a:graphicFrameLocks noChangeAspect="1"/>
+                </wp:cNvGraphicFramePr>
+                <a:graphic>
+                  <a:graphicData uri="http://schemas.openxmlformats.org/drawingml/2006/picture">
+                    <pic:pic>
+                      <pic:nvPicPr>
+                        <pic:cNvPr id="0" name="logo_officiel_couleur_avec_baseline.png"/>
+                        <pic:cNvPicPr/>
+                      </pic:nvPicPr>
+                      <pic:blipFill>
+                        <a:blip r:embed="rId1"/>
+                        <a:stretch>
+                          <a:fillRect/>
+                        </a:stretch>
+                      </pic:blipFill>
+                      <pic:spPr>
+                        <a:xfrm>
+                          <a:off x="0" y="0"/>
+                          <a:ext cx="2304000" cy="517248"/>
+                        </a:xfrm>
+                        <a:prstGeom prst="rect"/>
+                      </pic:spPr>
+                    </pic:pic>
+                  </a:graphicData>
+                </a:graphic>
+              </wp:inline>
+            </w:drawing>
+          </w:r>
+        </w:p>
+      </w:tc>
+      <w:tc>
+        <w:tcPr>
+          <w:tcW w:type="dxa" w:w="5102"/>
+          <w:vAlign w:val="center"/>
+        </w:tcPr>
+        <w:p>
+          <w:pPr>
+            <w:spacing w:after="0" w:line="230" w:lineRule="exact"/>
+            <w:jc w:val="right"/>
+          </w:pPr>
+          <w:r>
+            <w:rPr>
+              <w:rFonts w:ascii="Ubuntu Mono" w:hAnsi="Ubuntu Mono" w:cs="Ubuntu Mono" w:eastAsia="Ubuntu Mono"/>
+              <w:b/>
+              <w:color w:val="08203F"/>
+              <w:sz w:val="18"/>
+            </w:rPr>
+            <w:t>ENEDRIL</w:t>
+          </w:r>
+        </w:p>
+        <w:p>
+          <w:pPr>
+            <w:spacing w:after="0" w:line="230" w:lineRule="exact"/>
+            <w:jc w:val="right"/>
+          </w:pPr>
+          <w:r>
+            <w:rPr>
+              <w:rFonts w:ascii="Ubuntu Mono" w:hAnsi="Ubuntu Mono" w:cs="Ubuntu Mono" w:eastAsia="Ubuntu Mono"/>
+              <w:b w:val="0"/>
+              <w:color w:val="5A6B7F"/>
+              <w:sz w:val="18"/>
+            </w:rPr>
+            <w:t>3 avenue des Lacs</w:t>
+          </w:r>
+        </w:p>
+        <w:p>
+          <w:pPr>
+            <w:spacing w:after="0" w:line="230" w:lineRule="exact"/>
+            <w:jc w:val="right"/>
+          </w:pPr>
+          <w:r>
+            <w:rPr>
+              <w:rFonts w:ascii="Ubuntu Mono" w:hAnsi="Ubuntu Mono" w:cs="Ubuntu Mono" w:eastAsia="Ubuntu Mono"/>
+              <w:b w:val="0"/>
+              <w:color w:val="5A6B7F"/>
+              <w:sz w:val="18"/>
+            </w:rPr>
+            <w:t>64140 Lons (France)</w:t>
+          </w:r>
+        </w:p>
+        <w:p>
+          <w:pPr>
+            <w:spacing w:after="0" w:line="230" w:lineRule="exact"/>
+            <w:jc w:val="right"/>
+          </w:pPr>
+          <w:r>
+            <w:rPr>
+              <w:rFonts w:ascii="Ubuntu Mono" w:hAnsi="Ubuntu Mono" w:cs="Ubuntu Mono" w:eastAsia="Ubuntu Mono"/>
+              <w:b w:val="0"/>
+              <w:color w:val="5A6B7F"/>
+              <w:sz w:val="18"/>
+            </w:rPr>
+            <w:t>+33 (0)5 59 04 50 45</w:t>
+          </w:r>
+        </w:p>
+        <w:p>
+          <w:pPr>
+            <w:spacing w:after="0" w:line="230" w:lineRule="exact"/>
+            <w:jc w:val="right"/>
+          </w:pPr>
+          <w:r>
+            <w:rPr>
+              <w:rFonts w:ascii="Ubuntu Mono" w:hAnsi="Ubuntu Mono" w:cs="Ubuntu Mono" w:eastAsia="Ubuntu Mono"/>
+              <w:b w:val="0"/>
+              <w:color w:val="5A6B7F"/>
+              <w:sz w:val="18"/>
+            </w:rPr>
+            <w:t>info@enedril.fr</w:t>
+          </w:r>
+        </w:p>
+        <w:p>
+          <w:pPr>
+            <w:spacing w:after="0" w:line="230" w:lineRule="exact"/>
+            <w:jc w:val="right"/>
+          </w:pPr>
+          <w:r>
+            <w:rPr>
+              <w:rFonts w:ascii="Ubuntu Mono" w:hAnsi="Ubuntu Mono" w:cs="Ubuntu Mono" w:eastAsia="Ubuntu Mono"/>
+              <w:b/>
+              <w:color w:val="0A4FA0"/>
+              <w:sz w:val="18"/>
+            </w:rPr>
+            <w:t>www.enedril.com</w:t>
+          </w:r>
+        </w:p>
+      </w:tc>
+    </w:tr>
+  </w:tbl>
+  <w:p>
+    <w:pPr>
+      <w:spacing w:before="80" w:after="0"/>
+      <w:pBdr>
+        <w:top w:val="single" w:sz="12" w:space="1" w:color="1CB2FE"/>
+      </w:pBdr>
     </w:pPr>
     <w:r>
-      <w:drawing>
-        <wp:inline xmlns:a="http://schemas.openxmlformats.org/drawingml/2006/main" xmlns:pic="http://schemas.openxmlformats.org/drawingml/2006/picture">
-          <wp:extent cx="7560000" cy="1280323"/>
-          <wp:docPr id="1" name="Picture 1"/>
-          <wp:cNvGraphicFramePr>
-            <a:graphicFrameLocks noChangeAspect="1"/>
-          </wp:cNvGraphicFramePr>
-          <a:graphic>
-            <a:graphicData uri="http://schemas.openxmlformats.org/drawingml/2006/picture">
-              <pic:pic>
-                <pic:nvPicPr>
-                  <pic:cNvPr id="0" name="en_tete_image.png"/>
-                  <pic:cNvPicPr/>
-                </pic:nvPicPr>
-                <pic:blipFill>
-                  <a:blip r:embed="rId1"/>
-                  <a:stretch>
-                    <a:fillRect/>
-                  </a:stretch>
-                </pic:blipFill>
-                <pic:spPr>
-                  <a:xfrm>
-                    <a:off x="0" y="0"/>
-                    <a:ext cx="7560000" cy="1280323"/>
-                  </a:xfrm>
-                  <a:prstGeom prst="rect"/>
-                </pic:spPr>
-              </pic:pic>
-            </a:graphicData>
-          </a:graphic>
-        </wp:inline>
-      </w:drawing>
+      <w:rPr>
+        <w:rFonts w:ascii="Ubuntu Mono" w:hAnsi="Ubuntu Mono" w:cs="Ubuntu Mono" w:eastAsia="Ubuntu Mono"/>
+        <w:b w:val="0"/>
+        <w:sz w:val="4"/>
+      </w:rPr>
     </w:r>
   </w:p>
 </w:hdr>

</xml_diff>